<commit_message>
added github to docx file
</commit_message>
<xml_diff>
--- a/assignments/FIN-220-F25-HW2_Savage.docx
+++ b/assignments/FIN-220-F25-HW2_Savage.docx
@@ -42,6 +42,46 @@
           <w:sz w:val="29"/>
         </w:rPr>
         <w:t>Due on October 6, 2025</w:t>
+      </w:r>
+    </w:p>
+    <w:p>
+      <w:pPr>
+        <w:spacing w:after="250"/>
+        <w:ind w:left="-5"/>
+      </w:pPr>
+      <w:r>
+        <w:t xml:space="preserve">In my </w:t>
+      </w:r>
+      <w:proofErr w:type="spellStart"/>
+      <w:r>
+        <w:t>Git</w:t>
+      </w:r>
+      <w:r>
+        <w:t>hub</w:t>
+      </w:r>
+      <w:proofErr w:type="spellEnd"/>
+      <w:r>
+        <w:t>:</w:t>
+      </w:r>
+      <w:r>
+        <w:t xml:space="preserve"> </w:t>
+      </w:r>
+    </w:p>
+    <w:p>
+      <w:pPr>
+        <w:spacing w:after="250"/>
+        <w:ind w:left="-5"/>
+        <w:rPr>
+          <w:sz w:val="20"/>
+          <w:szCs w:val="20"/>
+        </w:rPr>
+      </w:pPr>
+      <w:r>
+        <w:rPr>
+          <w:sz w:val="20"/>
+          <w:szCs w:val="20"/>
+        </w:rPr>
+        <w:t>https://github.com/McSavage/FIN220/blob/main/assignments/HW2_Question123.ipynb</w:t>
       </w:r>
     </w:p>
     <w:p>
@@ -71,9 +111,22 @@
       </w:r>
       <w:proofErr w:type="spellEnd"/>
       <w:r>
-        <w:t>) with various hyperparameters, such as kernel=“linear” (with various values for the C hyperparameter) or kernel=“</w:t>
-      </w:r>
-      <w:proofErr w:type="spellStart"/>
+        <w:t>) with various hyperparameters, such as kernel</w:t>
+      </w:r>
+      <w:proofErr w:type="gramStart"/>
+      <w:r>
+        <w:t>=“</w:t>
+      </w:r>
+      <w:proofErr w:type="gramEnd"/>
+      <w:r>
+        <w:t>linear” (with various values for the C hyperparameter) or kernel</w:t>
+      </w:r>
+      <w:proofErr w:type="gramStart"/>
+      <w:r>
+        <w:t>=“</w:t>
+      </w:r>
+      <w:proofErr w:type="spellStart"/>
+      <w:proofErr w:type="gramEnd"/>
       <w:r>
         <w:t>rbf</w:t>
       </w:r>
@@ -98,10 +151,26 @@
         <w:t xml:space="preserve">Starting with </w:t>
       </w:r>
       <w:r>
-        <w:t>preprocessing = ColumnTransformer(</w:t>
-      </w:r>
-      <w:r>
-        <w:t xml:space="preserve"> from the 02_end_to_end_etc., notebook</w:t>
+        <w:t>preprocessing =</w:t>
+      </w:r>
+      <w:proofErr w:type="gramStart"/>
+      <w:r>
+        <w:t>ColumnTransformer(</w:t>
+      </w:r>
+      <w:proofErr w:type="gramEnd"/>
+      <w:r>
+        <w:t xml:space="preserve"> </w:t>
+      </w:r>
+    </w:p>
+    <w:p>
+      <w:pPr>
+        <w:ind w:left="309"/>
+      </w:pPr>
+      <w:r>
+        <w:t>from the 02_end_to_end_etc., notebook</w:t>
+      </w:r>
+      <w:r>
+        <w:t>…</w:t>
       </w:r>
     </w:p>
     <w:p>
@@ -226,16 +295,29 @@
         <w:t xml:space="preserve"> </w:t>
       </w:r>
       <w:proofErr w:type="spellStart"/>
-      <w:r>
-        <w:rPr>
-          <w:rFonts w:ascii="Consolas" w:eastAsia="Times New Roman" w:hAnsi="Consolas" w:cs="Times New Roman"/>
-          <w:color w:val="CCCCCC"/>
-          <w:kern w:val="0"/>
-          <w:sz w:val="16"/>
-          <w:szCs w:val="16"/>
-          <w14:ligatures w14:val="none"/>
-        </w:rPr>
-        <w:t>sklearn.model_selection</w:t>
+      <w:proofErr w:type="gramStart"/>
+      <w:r>
+        <w:rPr>
+          <w:rFonts w:ascii="Consolas" w:eastAsia="Times New Roman" w:hAnsi="Consolas" w:cs="Times New Roman"/>
+          <w:color w:val="CCCCCC"/>
+          <w:kern w:val="0"/>
+          <w:sz w:val="16"/>
+          <w:szCs w:val="16"/>
+          <w14:ligatures w14:val="none"/>
+        </w:rPr>
+        <w:t>sklearn.model</w:t>
+      </w:r>
+      <w:proofErr w:type="gramEnd"/>
+      <w:r>
+        <w:rPr>
+          <w:rFonts w:ascii="Consolas" w:eastAsia="Times New Roman" w:hAnsi="Consolas" w:cs="Times New Roman"/>
+          <w:color w:val="CCCCCC"/>
+          <w:kern w:val="0"/>
+          <w:sz w:val="16"/>
+          <w:szCs w:val="16"/>
+          <w14:ligatures w14:val="none"/>
+        </w:rPr>
+        <w:t>_selection</w:t>
       </w:r>
       <w:proofErr w:type="spellEnd"/>
       <w:r>
@@ -399,20 +481,57 @@
           <w:szCs w:val="16"/>
           <w14:ligatures w14:val="none"/>
         </w:rPr>
-        <w:t>make_pipeline</w:t>
-      </w:r>
-      <w:proofErr w:type="spellEnd"/>
-      <w:r>
-        <w:rPr>
-          <w:rFonts w:ascii="Consolas" w:eastAsia="Times New Roman" w:hAnsi="Consolas" w:cs="Times New Roman"/>
-          <w:color w:val="CCCCCC"/>
-          <w:kern w:val="0"/>
-          <w:sz w:val="16"/>
-          <w:szCs w:val="16"/>
-          <w14:ligatures w14:val="none"/>
-        </w:rPr>
-        <w:t>(preprocessing, SVR(</w:t>
-      </w:r>
+        <w:t>make_</w:t>
+      </w:r>
+      <w:proofErr w:type="gramStart"/>
+      <w:r>
+        <w:rPr>
+          <w:rFonts w:ascii="Consolas" w:eastAsia="Times New Roman" w:hAnsi="Consolas" w:cs="Times New Roman"/>
+          <w:color w:val="CCCCCC"/>
+          <w:kern w:val="0"/>
+          <w:sz w:val="16"/>
+          <w:szCs w:val="16"/>
+          <w14:ligatures w14:val="none"/>
+        </w:rPr>
+        <w:t>pipeline</w:t>
+      </w:r>
+      <w:proofErr w:type="spellEnd"/>
+      <w:r>
+        <w:rPr>
+          <w:rFonts w:ascii="Consolas" w:eastAsia="Times New Roman" w:hAnsi="Consolas" w:cs="Times New Roman"/>
+          <w:color w:val="CCCCCC"/>
+          <w:kern w:val="0"/>
+          <w:sz w:val="16"/>
+          <w:szCs w:val="16"/>
+          <w14:ligatures w14:val="none"/>
+        </w:rPr>
+        <w:t>(</w:t>
+      </w:r>
+      <w:proofErr w:type="gramEnd"/>
+      <w:r>
+        <w:rPr>
+          <w:rFonts w:ascii="Consolas" w:eastAsia="Times New Roman" w:hAnsi="Consolas" w:cs="Times New Roman"/>
+          <w:color w:val="CCCCCC"/>
+          <w:kern w:val="0"/>
+          <w:sz w:val="16"/>
+          <w:szCs w:val="16"/>
+          <w14:ligatures w14:val="none"/>
+        </w:rPr>
+        <w:t xml:space="preserve">preprocessing, </w:t>
+      </w:r>
+      <w:proofErr w:type="gramStart"/>
+      <w:r>
+        <w:rPr>
+          <w:rFonts w:ascii="Consolas" w:eastAsia="Times New Roman" w:hAnsi="Consolas" w:cs="Times New Roman"/>
+          <w:color w:val="CCCCCC"/>
+          <w:kern w:val="0"/>
+          <w:sz w:val="16"/>
+          <w:szCs w:val="16"/>
+          <w14:ligatures w14:val="none"/>
+        </w:rPr>
+        <w:t>SVR(</w:t>
+      </w:r>
+      <w:proofErr w:type="gramEnd"/>
       <w:r>
         <w:rPr>
           <w:rFonts w:ascii="Consolas" w:eastAsia="Times New Roman" w:hAnsi="Consolas" w:cs="Times New Roman"/>
@@ -630,6 +749,7 @@
         </w:rPr>
       </w:pPr>
       <w:proofErr w:type="spellStart"/>
+      <w:proofErr w:type="gramStart"/>
       <w:r>
         <w:rPr>
           <w:rFonts w:ascii="Consolas" w:eastAsia="Times New Roman" w:hAnsi="Consolas" w:cs="Times New Roman"/>
@@ -651,7 +771,19 @@
           <w:szCs w:val="16"/>
           <w14:ligatures w14:val="none"/>
         </w:rPr>
-        <w:t xml:space="preserve">(housing, </w:t>
+        <w:t>(</w:t>
+      </w:r>
+      <w:proofErr w:type="gramEnd"/>
+      <w:r>
+        <w:rPr>
+          <w:rFonts w:ascii="Consolas" w:eastAsia="Times New Roman" w:hAnsi="Consolas" w:cs="Times New Roman"/>
+          <w:color w:val="CCCCCC"/>
+          <w:kern w:val="0"/>
+          <w:sz w:val="16"/>
+          <w:szCs w:val="16"/>
+          <w14:ligatures w14:val="none"/>
+        </w:rPr>
+        <w:t xml:space="preserve">housing, </w:t>
       </w:r>
       <w:proofErr w:type="spellStart"/>
       <w:r>
@@ -721,6 +853,9 @@
       </w:pPr>
       <w:r>
         <w:t>Improvement: -35.6%</w:t>
+      </w:r>
+      <w:r>
+        <w:t xml:space="preserve"> - Worse</w:t>
       </w:r>
     </w:p>
     <w:p>
@@ -780,16 +915,29 @@
         <w:t xml:space="preserve"> </w:t>
       </w:r>
       <w:proofErr w:type="spellStart"/>
-      <w:r>
-        <w:rPr>
-          <w:rFonts w:ascii="Consolas" w:eastAsia="Times New Roman" w:hAnsi="Consolas" w:cs="Times New Roman"/>
-          <w:color w:val="CCCCCC"/>
-          <w:kern w:val="0"/>
-          <w:sz w:val="16"/>
-          <w:szCs w:val="16"/>
-          <w14:ligatures w14:val="none"/>
-        </w:rPr>
-        <w:t>sklearn.model_selection</w:t>
+      <w:proofErr w:type="gramStart"/>
+      <w:r>
+        <w:rPr>
+          <w:rFonts w:ascii="Consolas" w:eastAsia="Times New Roman" w:hAnsi="Consolas" w:cs="Times New Roman"/>
+          <w:color w:val="CCCCCC"/>
+          <w:kern w:val="0"/>
+          <w:sz w:val="16"/>
+          <w:szCs w:val="16"/>
+          <w14:ligatures w14:val="none"/>
+        </w:rPr>
+        <w:t>sklearn.model</w:t>
+      </w:r>
+      <w:proofErr w:type="gramEnd"/>
+      <w:r>
+        <w:rPr>
+          <w:rFonts w:ascii="Consolas" w:eastAsia="Times New Roman" w:hAnsi="Consolas" w:cs="Times New Roman"/>
+          <w:color w:val="CCCCCC"/>
+          <w:kern w:val="0"/>
+          <w:sz w:val="16"/>
+          <w:szCs w:val="16"/>
+          <w14:ligatures w14:val="none"/>
+        </w:rPr>
+        <w:t>_selection</w:t>
       </w:r>
       <w:proofErr w:type="spellEnd"/>
       <w:r>
@@ -844,9 +992,14 @@
         <w:ind w:left="0" w:firstLine="720"/>
       </w:pPr>
       <w:r>
-        <w:t>with the kernels ‘linear’, ‘</w:t>
-      </w:r>
-      <w:proofErr w:type="spellStart"/>
+        <w:t>with the kernels ‘linear</w:t>
+      </w:r>
+      <w:proofErr w:type="gramStart"/>
+      <w:r>
+        <w:t>’, ‘</w:t>
+      </w:r>
+      <w:proofErr w:type="spellStart"/>
+      <w:proofErr w:type="gramEnd"/>
       <w:r>
         <w:t>rbf</w:t>
       </w:r>
@@ -854,6 +1007,15 @@
       <w:r>
         <w:t xml:space="preserve">, and ‘ply’ </w:t>
       </w:r>
+      <w:r>
+        <w:t>-</w:t>
+      </w:r>
+    </w:p>
+    <w:p>
+      <w:pPr>
+        <w:ind w:left="0" w:firstLine="720"/>
+      </w:pPr>
+      <w:proofErr w:type="gramStart"/>
       <w:r>
         <w:rPr>
           <w:b/>
@@ -861,6 +1023,7 @@
         </w:rPr>
         <w:t>linear</w:t>
       </w:r>
+      <w:proofErr w:type="gramEnd"/>
       <w:r>
         <w:t xml:space="preserve"> returns the smallest RMSE</w:t>
       </w:r>
@@ -916,16 +1079,29 @@
         <w:t xml:space="preserve"> </w:t>
       </w:r>
       <w:proofErr w:type="spellStart"/>
-      <w:r>
-        <w:rPr>
-          <w:rFonts w:ascii="Consolas" w:eastAsia="Times New Roman" w:hAnsi="Consolas" w:cs="Times New Roman"/>
-          <w:color w:val="CCCCCC"/>
-          <w:kern w:val="0"/>
-          <w:sz w:val="16"/>
-          <w:szCs w:val="16"/>
-          <w14:ligatures w14:val="none"/>
-        </w:rPr>
-        <w:t>sklearn.model_selection</w:t>
+      <w:proofErr w:type="gramStart"/>
+      <w:r>
+        <w:rPr>
+          <w:rFonts w:ascii="Consolas" w:eastAsia="Times New Roman" w:hAnsi="Consolas" w:cs="Times New Roman"/>
+          <w:color w:val="CCCCCC"/>
+          <w:kern w:val="0"/>
+          <w:sz w:val="16"/>
+          <w:szCs w:val="16"/>
+          <w14:ligatures w14:val="none"/>
+        </w:rPr>
+        <w:t>sklearn.model</w:t>
+      </w:r>
+      <w:proofErr w:type="gramEnd"/>
+      <w:r>
+        <w:rPr>
+          <w:rFonts w:ascii="Consolas" w:eastAsia="Times New Roman" w:hAnsi="Consolas" w:cs="Times New Roman"/>
+          <w:color w:val="CCCCCC"/>
+          <w:kern w:val="0"/>
+          <w:sz w:val="16"/>
+          <w:szCs w:val="16"/>
+          <w14:ligatures w14:val="none"/>
+        </w:rPr>
+        <w:t>_selection</w:t>
       </w:r>
       <w:proofErr w:type="spellEnd"/>
       <w:r>
@@ -979,6 +1155,14 @@
       <w:pPr>
         <w:ind w:left="309"/>
       </w:pPr>
+      <w:r>
+        <w:t xml:space="preserve">specifying the ‘linear’ </w:t>
+      </w:r>
+      <w:proofErr w:type="gramStart"/>
+      <w:r>
+        <w:t>model;</w:t>
+      </w:r>
+      <w:proofErr w:type="gramEnd"/>
     </w:p>
     <w:p>
       <w:pPr>
@@ -1080,6 +1264,7 @@
         <w:t>'</w:t>
       </w:r>
       <w:proofErr w:type="spellStart"/>
+      <w:proofErr w:type="gramStart"/>
       <w:r>
         <w:rPr>
           <w:rFonts w:ascii="Consolas" w:eastAsia="Times New Roman" w:hAnsi="Consolas" w:cs="Times New Roman"/>
@@ -1092,6 +1277,7 @@
         <w:t>svr</w:t>
       </w:r>
       <w:proofErr w:type="spellEnd"/>
+      <w:proofErr w:type="gramEnd"/>
       <w:r>
         <w:rPr>
           <w:rFonts w:ascii="Consolas" w:eastAsia="Times New Roman" w:hAnsi="Consolas" w:cs="Times New Roman"/>
@@ -1219,6 +1405,7 @@
         <w:t>'</w:t>
       </w:r>
       <w:proofErr w:type="spellStart"/>
+      <w:proofErr w:type="gramStart"/>
       <w:r>
         <w:rPr>
           <w:rFonts w:ascii="Consolas" w:eastAsia="Times New Roman" w:hAnsi="Consolas" w:cs="Times New Roman"/>
@@ -1231,6 +1418,7 @@
         <w:t>svr</w:t>
       </w:r>
       <w:proofErr w:type="spellEnd"/>
+      <w:proofErr w:type="gramEnd"/>
       <w:r>
         <w:rPr>
           <w:rFonts w:ascii="Consolas" w:eastAsia="Times New Roman" w:hAnsi="Consolas" w:cs="Times New Roman"/>
@@ -1402,6 +1590,7 @@
         <w:t>'</w:t>
       </w:r>
       <w:proofErr w:type="spellStart"/>
+      <w:proofErr w:type="gramStart"/>
       <w:r>
         <w:rPr>
           <w:rFonts w:ascii="Consolas" w:eastAsia="Times New Roman" w:hAnsi="Consolas" w:cs="Times New Roman"/>
@@ -1414,6 +1603,7 @@
         <w:t>svr</w:t>
       </w:r>
       <w:proofErr w:type="spellEnd"/>
+      <w:proofErr w:type="gramEnd"/>
       <w:r>
         <w:rPr>
           <w:rFonts w:ascii="Consolas" w:eastAsia="Times New Roman" w:hAnsi="Consolas" w:cs="Times New Roman"/>
@@ -1617,20 +1807,57 @@
           <w:szCs w:val="21"/>
           <w14:ligatures w14:val="none"/>
         </w:rPr>
-        <w:t>make_pipeline</w:t>
-      </w:r>
-      <w:proofErr w:type="spellEnd"/>
-      <w:r>
-        <w:rPr>
-          <w:rFonts w:ascii="Consolas" w:eastAsia="Times New Roman" w:hAnsi="Consolas" w:cs="Times New Roman"/>
-          <w:color w:val="CCCCCC"/>
-          <w:kern w:val="0"/>
-          <w:sz w:val="21"/>
-          <w:szCs w:val="21"/>
-          <w14:ligatures w14:val="none"/>
-        </w:rPr>
-        <w:t>(preprocessing, SVR(</w:t>
-      </w:r>
+        <w:t>make_</w:t>
+      </w:r>
+      <w:proofErr w:type="gramStart"/>
+      <w:r>
+        <w:rPr>
+          <w:rFonts w:ascii="Consolas" w:eastAsia="Times New Roman" w:hAnsi="Consolas" w:cs="Times New Roman"/>
+          <w:color w:val="CCCCCC"/>
+          <w:kern w:val="0"/>
+          <w:sz w:val="21"/>
+          <w:szCs w:val="21"/>
+          <w14:ligatures w14:val="none"/>
+        </w:rPr>
+        <w:t>pipeline</w:t>
+      </w:r>
+      <w:proofErr w:type="spellEnd"/>
+      <w:r>
+        <w:rPr>
+          <w:rFonts w:ascii="Consolas" w:eastAsia="Times New Roman" w:hAnsi="Consolas" w:cs="Times New Roman"/>
+          <w:color w:val="CCCCCC"/>
+          <w:kern w:val="0"/>
+          <w:sz w:val="21"/>
+          <w:szCs w:val="21"/>
+          <w14:ligatures w14:val="none"/>
+        </w:rPr>
+        <w:t>(</w:t>
+      </w:r>
+      <w:proofErr w:type="gramEnd"/>
+      <w:r>
+        <w:rPr>
+          <w:rFonts w:ascii="Consolas" w:eastAsia="Times New Roman" w:hAnsi="Consolas" w:cs="Times New Roman"/>
+          <w:color w:val="CCCCCC"/>
+          <w:kern w:val="0"/>
+          <w:sz w:val="21"/>
+          <w:szCs w:val="21"/>
+          <w14:ligatures w14:val="none"/>
+        </w:rPr>
+        <w:t xml:space="preserve">preprocessing, </w:t>
+      </w:r>
+      <w:proofErr w:type="gramStart"/>
+      <w:r>
+        <w:rPr>
+          <w:rFonts w:ascii="Consolas" w:eastAsia="Times New Roman" w:hAnsi="Consolas" w:cs="Times New Roman"/>
+          <w:color w:val="CCCCCC"/>
+          <w:kern w:val="0"/>
+          <w:sz w:val="21"/>
+          <w:szCs w:val="21"/>
+          <w14:ligatures w14:val="none"/>
+        </w:rPr>
+        <w:t>SVR(</w:t>
+      </w:r>
+      <w:proofErr w:type="gramEnd"/>
       <w:r>
         <w:rPr>
           <w:rFonts w:ascii="Consolas" w:eastAsia="Times New Roman" w:hAnsi="Consolas" w:cs="Times New Roman"/>
@@ -1781,6 +2008,7 @@
         <w:t xml:space="preserve"> </w:t>
       </w:r>
       <w:proofErr w:type="spellStart"/>
+      <w:proofErr w:type="gramStart"/>
       <w:r>
         <w:rPr>
           <w:rFonts w:ascii="Consolas" w:eastAsia="Times New Roman" w:hAnsi="Consolas" w:cs="Times New Roman"/>
@@ -1804,6 +2032,7 @@
         </w:rPr>
         <w:t>(</w:t>
       </w:r>
+      <w:proofErr w:type="gramEnd"/>
     </w:p>
     <w:p>
       <w:pPr>
@@ -2194,6 +2423,7 @@
         </w:rPr>
         <w:t>=-</w:t>
       </w:r>
+      <w:proofErr w:type="gramStart"/>
       <w:r>
         <w:rPr>
           <w:rFonts w:ascii="Consolas" w:eastAsia="Times New Roman" w:hAnsi="Consolas" w:cs="Times New Roman"/>
@@ -2225,7 +2455,19 @@
           <w:szCs w:val="21"/>
           <w14:ligatures w14:val="none"/>
         </w:rPr>
-        <w:t># Use all available cores</w:t>
+        <w:t>#</w:t>
+      </w:r>
+      <w:proofErr w:type="gramEnd"/>
+      <w:r>
+        <w:rPr>
+          <w:rFonts w:ascii="Consolas" w:eastAsia="Times New Roman" w:hAnsi="Consolas" w:cs="Times New Roman"/>
+          <w:color w:val="6A9955"/>
+          <w:kern w:val="0"/>
+          <w:sz w:val="21"/>
+          <w:szCs w:val="21"/>
+          <w14:ligatures w14:val="none"/>
+        </w:rPr>
+        <w:t xml:space="preserve"> Use all available cores</w:t>
       </w:r>
     </w:p>
     <w:p>
@@ -2287,6 +2529,7 @@
         </w:rPr>
       </w:pPr>
       <w:proofErr w:type="spellStart"/>
+      <w:proofErr w:type="gramStart"/>
       <w:r>
         <w:rPr>
           <w:rFonts w:ascii="Consolas" w:eastAsia="Times New Roman" w:hAnsi="Consolas" w:cs="Times New Roman"/>
@@ -2308,7 +2551,19 @@
           <w:szCs w:val="21"/>
           <w14:ligatures w14:val="none"/>
         </w:rPr>
-        <w:t xml:space="preserve">(housing, </w:t>
+        <w:t>(</w:t>
+      </w:r>
+      <w:proofErr w:type="gramEnd"/>
+      <w:r>
+        <w:rPr>
+          <w:rFonts w:ascii="Consolas" w:eastAsia="Times New Roman" w:hAnsi="Consolas" w:cs="Times New Roman"/>
+          <w:color w:val="CCCCCC"/>
+          <w:kern w:val="0"/>
+          <w:sz w:val="21"/>
+          <w:szCs w:val="21"/>
+          <w14:ligatures w14:val="none"/>
+        </w:rPr>
+        <w:t xml:space="preserve">housing, </w:t>
       </w:r>
       <w:proofErr w:type="spellStart"/>
       <w:r>
@@ -2393,8 +2648,13 @@
       </w:r>
       <w:proofErr w:type="spellEnd"/>
       <w:r>
-        <w:t>__gamma': 'scale'}</w:t>
-      </w:r>
+        <w:t>__gamma': '</w:t>
+      </w:r>
+      <w:proofErr w:type="gramStart"/>
+      <w:r>
+        <w:t>scale'}</w:t>
+      </w:r>
+      <w:proofErr w:type="gramEnd"/>
     </w:p>
     <w:p>
       <w:pPr>
@@ -2460,8 +2720,29 @@
       </w:r>
       <w:proofErr w:type="spellEnd"/>
       <w:r>
-        <w:t>.</w:t>
-      </w:r>
+        <w:t xml:space="preserve"> </w:t>
+      </w:r>
+    </w:p>
+    <w:p>
+      <w:pPr>
+        <w:ind w:left="299" w:firstLine="0"/>
+      </w:pPr>
+      <w:r>
+        <w:t>Using the ‘</w:t>
+      </w:r>
+      <w:proofErr w:type="spellStart"/>
+      <w:r>
+        <w:t>rbf</w:t>
+      </w:r>
+      <w:proofErr w:type="spellEnd"/>
+      <w:r>
+        <w:t xml:space="preserve">’ </w:t>
+      </w:r>
+      <w:proofErr w:type="gramStart"/>
+      <w:r>
+        <w:t>kernel;</w:t>
+      </w:r>
+      <w:proofErr w:type="gramEnd"/>
     </w:p>
     <w:p>
       <w:pPr>
@@ -2571,6 +2852,7 @@
         <w:t>'</w:t>
       </w:r>
       <w:proofErr w:type="spellStart"/>
+      <w:proofErr w:type="gramStart"/>
       <w:r>
         <w:rPr>
           <w:rFonts w:ascii="Consolas" w:eastAsia="Times New Roman" w:hAnsi="Consolas" w:cs="Times New Roman"/>
@@ -2583,6 +2865,7 @@
         <w:t>svr</w:t>
       </w:r>
       <w:proofErr w:type="spellEnd"/>
+      <w:proofErr w:type="gramEnd"/>
       <w:r>
         <w:rPr>
           <w:rFonts w:ascii="Consolas" w:eastAsia="Times New Roman" w:hAnsi="Consolas" w:cs="Times New Roman"/>
@@ -2606,6 +2889,7 @@
         <w:t xml:space="preserve">: </w:t>
       </w:r>
       <w:proofErr w:type="spellStart"/>
+      <w:proofErr w:type="gramStart"/>
       <w:r>
         <w:rPr>
           <w:rFonts w:ascii="Consolas" w:eastAsia="Times New Roman" w:hAnsi="Consolas" w:cs="Times New Roman"/>
@@ -2629,6 +2913,7 @@
         </w:rPr>
         <w:t>(</w:t>
       </w:r>
+      <w:proofErr w:type="gramEnd"/>
       <w:r>
         <w:rPr>
           <w:rFonts w:ascii="Consolas" w:eastAsia="Times New Roman" w:hAnsi="Consolas" w:cs="Times New Roman"/>
@@ -2662,16 +2947,29 @@
         </w:rPr>
         <w:t>1000</w:t>
       </w:r>
-      <w:r>
-        <w:rPr>
-          <w:rFonts w:ascii="Consolas" w:eastAsia="Times New Roman" w:hAnsi="Consolas" w:cs="Times New Roman"/>
-          <w:color w:val="CCCCCC"/>
-          <w:kern w:val="0"/>
-          <w:sz w:val="16"/>
-          <w:szCs w:val="16"/>
-          <w14:ligatures w14:val="none"/>
-        </w:rPr>
-        <w:t>),          </w:t>
+      <w:proofErr w:type="gramStart"/>
+      <w:r>
+        <w:rPr>
+          <w:rFonts w:ascii="Consolas" w:eastAsia="Times New Roman" w:hAnsi="Consolas" w:cs="Times New Roman"/>
+          <w:color w:val="CCCCCC"/>
+          <w:kern w:val="0"/>
+          <w:sz w:val="16"/>
+          <w:szCs w:val="16"/>
+          <w14:ligatures w14:val="none"/>
+        </w:rPr>
+        <w:t xml:space="preserve">),   </w:t>
+      </w:r>
+      <w:proofErr w:type="gramEnd"/>
+      <w:r>
+        <w:rPr>
+          <w:rFonts w:ascii="Consolas" w:eastAsia="Times New Roman" w:hAnsi="Consolas" w:cs="Times New Roman"/>
+          <w:color w:val="CCCCCC"/>
+          <w:kern w:val="0"/>
+          <w:sz w:val="16"/>
+          <w:szCs w:val="16"/>
+          <w14:ligatures w14:val="none"/>
+        </w:rPr>
+        <w:t>       </w:t>
       </w:r>
       <w:r>
         <w:rPr>
@@ -2727,6 +3025,7 @@
         <w:t>'</w:t>
       </w:r>
       <w:proofErr w:type="spellStart"/>
+      <w:proofErr w:type="gramStart"/>
       <w:r>
         <w:rPr>
           <w:rFonts w:ascii="Consolas" w:eastAsia="Times New Roman" w:hAnsi="Consolas" w:cs="Times New Roman"/>
@@ -2739,6 +3038,7 @@
         <w:t>svr</w:t>
       </w:r>
       <w:proofErr w:type="spellEnd"/>
+      <w:proofErr w:type="gramEnd"/>
       <w:r>
         <w:rPr>
           <w:rFonts w:ascii="Consolas" w:eastAsia="Times New Roman" w:hAnsi="Consolas" w:cs="Times New Roman"/>
@@ -2762,6 +3062,7 @@
         <w:t xml:space="preserve">: </w:t>
       </w:r>
       <w:proofErr w:type="spellStart"/>
+      <w:proofErr w:type="gramStart"/>
       <w:r>
         <w:rPr>
           <w:rFonts w:ascii="Consolas" w:eastAsia="Times New Roman" w:hAnsi="Consolas" w:cs="Times New Roman"/>
@@ -2785,6 +3086,7 @@
         </w:rPr>
         <w:t>(</w:t>
       </w:r>
+      <w:proofErr w:type="gramEnd"/>
       <w:r>
         <w:rPr>
           <w:rFonts w:ascii="Consolas" w:eastAsia="Times New Roman" w:hAnsi="Consolas" w:cs="Times New Roman"/>
@@ -2818,16 +3120,29 @@
         </w:rPr>
         <w:t>1</w:t>
       </w:r>
-      <w:r>
-        <w:rPr>
-          <w:rFonts w:ascii="Consolas" w:eastAsia="Times New Roman" w:hAnsi="Consolas" w:cs="Times New Roman"/>
-          <w:color w:val="CCCCCC"/>
-          <w:kern w:val="0"/>
-          <w:sz w:val="16"/>
-          <w:szCs w:val="16"/>
-          <w14:ligatures w14:val="none"/>
-        </w:rPr>
-        <w:t>),    </w:t>
+      <w:proofErr w:type="gramStart"/>
+      <w:r>
+        <w:rPr>
+          <w:rFonts w:ascii="Consolas" w:eastAsia="Times New Roman" w:hAnsi="Consolas" w:cs="Times New Roman"/>
+          <w:color w:val="CCCCCC"/>
+          <w:kern w:val="0"/>
+          <w:sz w:val="16"/>
+          <w:szCs w:val="16"/>
+          <w14:ligatures w14:val="none"/>
+        </w:rPr>
+        <w:t xml:space="preserve">),   </w:t>
+      </w:r>
+      <w:proofErr w:type="gramEnd"/>
+      <w:r>
+        <w:rPr>
+          <w:rFonts w:ascii="Consolas" w:eastAsia="Times New Roman" w:hAnsi="Consolas" w:cs="Times New Roman"/>
+          <w:color w:val="CCCCCC"/>
+          <w:kern w:val="0"/>
+          <w:sz w:val="16"/>
+          <w:szCs w:val="16"/>
+          <w14:ligatures w14:val="none"/>
+        </w:rPr>
+        <w:t> </w:t>
       </w:r>
       <w:r>
         <w:rPr>
@@ -2883,6 +3198,7 @@
         <w:t>'</w:t>
       </w:r>
       <w:proofErr w:type="spellStart"/>
+      <w:proofErr w:type="gramStart"/>
       <w:r>
         <w:rPr>
           <w:rFonts w:ascii="Consolas" w:eastAsia="Times New Roman" w:hAnsi="Consolas" w:cs="Times New Roman"/>
@@ -2895,6 +3211,7 @@
         <w:t>svr</w:t>
       </w:r>
       <w:proofErr w:type="spellEnd"/>
+      <w:proofErr w:type="gramEnd"/>
       <w:r>
         <w:rPr>
           <w:rFonts w:ascii="Consolas" w:eastAsia="Times New Roman" w:hAnsi="Consolas" w:cs="Times New Roman"/>
@@ -2915,8 +3232,21 @@
           <w:szCs w:val="16"/>
           <w14:ligatures w14:val="none"/>
         </w:rPr>
-        <w:t>: uniform(</w:t>
-      </w:r>
+        <w:t xml:space="preserve">: </w:t>
+      </w:r>
+      <w:proofErr w:type="gramStart"/>
+      <w:r>
+        <w:rPr>
+          <w:rFonts w:ascii="Consolas" w:eastAsia="Times New Roman" w:hAnsi="Consolas" w:cs="Times New Roman"/>
+          <w:color w:val="CCCCCC"/>
+          <w:kern w:val="0"/>
+          <w:sz w:val="16"/>
+          <w:szCs w:val="16"/>
+          <w14:ligatures w14:val="none"/>
+        </w:rPr>
+        <w:t>uniform(</w:t>
+      </w:r>
+      <w:proofErr w:type="gramEnd"/>
       <w:r>
         <w:rPr>
           <w:rFonts w:ascii="Consolas" w:eastAsia="Times New Roman" w:hAnsi="Consolas" w:cs="Times New Roman"/>
@@ -2950,16 +3280,29 @@
         </w:rPr>
         <w:t>0.5</w:t>
       </w:r>
-      <w:r>
-        <w:rPr>
-          <w:rFonts w:ascii="Consolas" w:eastAsia="Times New Roman" w:hAnsi="Consolas" w:cs="Times New Roman"/>
-          <w:color w:val="CCCCCC"/>
-          <w:kern w:val="0"/>
-          <w:sz w:val="16"/>
-          <w:szCs w:val="16"/>
-          <w14:ligatures w14:val="none"/>
-        </w:rPr>
-        <w:t xml:space="preserve">),     </w:t>
+      <w:proofErr w:type="gramStart"/>
+      <w:r>
+        <w:rPr>
+          <w:rFonts w:ascii="Consolas" w:eastAsia="Times New Roman" w:hAnsi="Consolas" w:cs="Times New Roman"/>
+          <w:color w:val="CCCCCC"/>
+          <w:kern w:val="0"/>
+          <w:sz w:val="16"/>
+          <w:szCs w:val="16"/>
+          <w14:ligatures w14:val="none"/>
+        </w:rPr>
+        <w:t xml:space="preserve">),   </w:t>
+      </w:r>
+      <w:proofErr w:type="gramEnd"/>
+      <w:r>
+        <w:rPr>
+          <w:rFonts w:ascii="Consolas" w:eastAsia="Times New Roman" w:hAnsi="Consolas" w:cs="Times New Roman"/>
+          <w:color w:val="CCCCCC"/>
+          <w:kern w:val="0"/>
+          <w:sz w:val="16"/>
+          <w:szCs w:val="16"/>
+          <w14:ligatures w14:val="none"/>
+        </w:rPr>
+        <w:t xml:space="preserve">  </w:t>
       </w:r>
       <w:r>
         <w:rPr>
@@ -3130,20 +3473,57 @@
           <w:szCs w:val="16"/>
           <w14:ligatures w14:val="none"/>
         </w:rPr>
-        <w:t>make_pipeline</w:t>
-      </w:r>
-      <w:proofErr w:type="spellEnd"/>
-      <w:r>
-        <w:rPr>
-          <w:rFonts w:ascii="Consolas" w:eastAsia="Times New Roman" w:hAnsi="Consolas" w:cs="Times New Roman"/>
-          <w:color w:val="CCCCCC"/>
-          <w:kern w:val="0"/>
-          <w:sz w:val="16"/>
-          <w:szCs w:val="16"/>
-          <w14:ligatures w14:val="none"/>
-        </w:rPr>
-        <w:t>(preprocessing, SVR(</w:t>
-      </w:r>
+        <w:t>make_</w:t>
+      </w:r>
+      <w:proofErr w:type="gramStart"/>
+      <w:r>
+        <w:rPr>
+          <w:rFonts w:ascii="Consolas" w:eastAsia="Times New Roman" w:hAnsi="Consolas" w:cs="Times New Roman"/>
+          <w:color w:val="CCCCCC"/>
+          <w:kern w:val="0"/>
+          <w:sz w:val="16"/>
+          <w:szCs w:val="16"/>
+          <w14:ligatures w14:val="none"/>
+        </w:rPr>
+        <w:t>pipeline</w:t>
+      </w:r>
+      <w:proofErr w:type="spellEnd"/>
+      <w:r>
+        <w:rPr>
+          <w:rFonts w:ascii="Consolas" w:eastAsia="Times New Roman" w:hAnsi="Consolas" w:cs="Times New Roman"/>
+          <w:color w:val="CCCCCC"/>
+          <w:kern w:val="0"/>
+          <w:sz w:val="16"/>
+          <w:szCs w:val="16"/>
+          <w14:ligatures w14:val="none"/>
+        </w:rPr>
+        <w:t>(</w:t>
+      </w:r>
+      <w:proofErr w:type="gramEnd"/>
+      <w:r>
+        <w:rPr>
+          <w:rFonts w:ascii="Consolas" w:eastAsia="Times New Roman" w:hAnsi="Consolas" w:cs="Times New Roman"/>
+          <w:color w:val="CCCCCC"/>
+          <w:kern w:val="0"/>
+          <w:sz w:val="16"/>
+          <w:szCs w:val="16"/>
+          <w14:ligatures w14:val="none"/>
+        </w:rPr>
+        <w:t xml:space="preserve">preprocessing, </w:t>
+      </w:r>
+      <w:proofErr w:type="gramStart"/>
+      <w:r>
+        <w:rPr>
+          <w:rFonts w:ascii="Consolas" w:eastAsia="Times New Roman" w:hAnsi="Consolas" w:cs="Times New Roman"/>
+          <w:color w:val="CCCCCC"/>
+          <w:kern w:val="0"/>
+          <w:sz w:val="16"/>
+          <w:szCs w:val="16"/>
+          <w14:ligatures w14:val="none"/>
+        </w:rPr>
+        <w:t>SVR(</w:t>
+      </w:r>
+      <w:proofErr w:type="gramEnd"/>
       <w:r>
         <w:rPr>
           <w:rFonts w:ascii="Consolas" w:eastAsia="Times New Roman" w:hAnsi="Consolas" w:cs="Times New Roman"/>
@@ -3354,6 +3734,7 @@
         <w:t xml:space="preserve"> </w:t>
       </w:r>
       <w:proofErr w:type="spellStart"/>
+      <w:proofErr w:type="gramStart"/>
       <w:r>
         <w:rPr>
           <w:rFonts w:ascii="Consolas" w:eastAsia="Times New Roman" w:hAnsi="Consolas" w:cs="Times New Roman"/>
@@ -3366,6 +3747,7 @@
         <w:t>time.time</w:t>
       </w:r>
       <w:proofErr w:type="spellEnd"/>
+      <w:proofErr w:type="gramEnd"/>
       <w:r>
         <w:rPr>
           <w:rFonts w:ascii="Consolas" w:eastAsia="Times New Roman" w:hAnsi="Consolas" w:cs="Times New Roman"/>
@@ -3464,6 +3846,7 @@
         <w:t xml:space="preserve"> </w:t>
       </w:r>
       <w:proofErr w:type="spellStart"/>
+      <w:proofErr w:type="gramStart"/>
       <w:r>
         <w:rPr>
           <w:rFonts w:ascii="Consolas" w:eastAsia="Times New Roman" w:hAnsi="Consolas" w:cs="Times New Roman"/>
@@ -3487,6 +3870,7 @@
         </w:rPr>
         <w:t>(</w:t>
       </w:r>
+      <w:proofErr w:type="gramEnd"/>
     </w:p>
     <w:p>
       <w:pPr>
@@ -3676,6 +4060,7 @@
         </w:rPr>
         <w:t>=</w:t>
       </w:r>
+      <w:proofErr w:type="gramStart"/>
       <w:r>
         <w:rPr>
           <w:rFonts w:ascii="Consolas" w:eastAsia="Times New Roman" w:hAnsi="Consolas" w:cs="Times New Roman"/>
@@ -3707,7 +4092,19 @@
           <w:szCs w:val="16"/>
           <w14:ligatures w14:val="none"/>
         </w:rPr>
-        <w:t># Number of parameter settings to sample</w:t>
+        <w:t>#</w:t>
+      </w:r>
+      <w:proofErr w:type="gramEnd"/>
+      <w:r>
+        <w:rPr>
+          <w:rFonts w:ascii="Consolas" w:eastAsia="Times New Roman" w:hAnsi="Consolas" w:cs="Times New Roman"/>
+          <w:color w:val="6A9955"/>
+          <w:kern w:val="0"/>
+          <w:sz w:val="16"/>
+          <w:szCs w:val="16"/>
+          <w14:ligatures w14:val="none"/>
+        </w:rPr>
+        <w:t xml:space="preserve"> Number of parameter settings to sample</w:t>
       </w:r>
     </w:p>
     <w:p>
@@ -4090,6 +4487,7 @@
         </w:rPr>
         <w:t>=</w:t>
       </w:r>
+      <w:proofErr w:type="gramStart"/>
       <w:r>
         <w:rPr>
           <w:rFonts w:ascii="Consolas" w:eastAsia="Times New Roman" w:hAnsi="Consolas" w:cs="Times New Roman"/>
@@ -4121,7 +4519,19 @@
           <w:szCs w:val="16"/>
           <w14:ligatures w14:val="none"/>
         </w:rPr>
-        <w:t># For reproducibility</w:t>
+        <w:t>#</w:t>
+      </w:r>
+      <w:proofErr w:type="gramEnd"/>
+      <w:r>
+        <w:rPr>
+          <w:rFonts w:ascii="Consolas" w:eastAsia="Times New Roman" w:hAnsi="Consolas" w:cs="Times New Roman"/>
+          <w:color w:val="6A9955"/>
+          <w:kern w:val="0"/>
+          <w:sz w:val="16"/>
+          <w:szCs w:val="16"/>
+          <w14:ligatures w14:val="none"/>
+        </w:rPr>
+        <w:t xml:space="preserve"> For reproducibility</w:t>
       </w:r>
     </w:p>
     <w:p>
@@ -4195,6 +4605,7 @@
         </w:rPr>
       </w:pPr>
       <w:proofErr w:type="spellStart"/>
+      <w:proofErr w:type="gramStart"/>
       <w:r>
         <w:rPr>
           <w:rFonts w:ascii="Consolas" w:eastAsia="Times New Roman" w:hAnsi="Consolas" w:cs="Times New Roman"/>
@@ -4216,7 +4627,19 @@
           <w:szCs w:val="16"/>
           <w14:ligatures w14:val="none"/>
         </w:rPr>
-        <w:t xml:space="preserve">(housing, </w:t>
+        <w:t>(</w:t>
+      </w:r>
+      <w:proofErr w:type="gramEnd"/>
+      <w:r>
+        <w:rPr>
+          <w:rFonts w:ascii="Consolas" w:eastAsia="Times New Roman" w:hAnsi="Consolas" w:cs="Times New Roman"/>
+          <w:color w:val="CCCCCC"/>
+          <w:kern w:val="0"/>
+          <w:sz w:val="16"/>
+          <w:szCs w:val="16"/>
+          <w14:ligatures w14:val="none"/>
+        </w:rPr>
+        <w:t xml:space="preserve">housing, </w:t>
       </w:r>
       <w:proofErr w:type="spellStart"/>
       <w:r>
@@ -4336,16 +4759,29 @@
         <w:t xml:space="preserve"> </w:t>
       </w:r>
       <w:proofErr w:type="spellStart"/>
-      <w:r>
-        <w:rPr>
-          <w:rFonts w:ascii="Consolas" w:eastAsia="Times New Roman" w:hAnsi="Consolas" w:cs="Times New Roman"/>
-          <w:color w:val="CCCCCC"/>
-          <w:kern w:val="0"/>
-          <w:sz w:val="16"/>
-          <w:szCs w:val="16"/>
-          <w14:ligatures w14:val="none"/>
-        </w:rPr>
-        <w:t>sklearn.feature_selection</w:t>
+      <w:proofErr w:type="gramStart"/>
+      <w:r>
+        <w:rPr>
+          <w:rFonts w:ascii="Consolas" w:eastAsia="Times New Roman" w:hAnsi="Consolas" w:cs="Times New Roman"/>
+          <w:color w:val="CCCCCC"/>
+          <w:kern w:val="0"/>
+          <w:sz w:val="16"/>
+          <w:szCs w:val="16"/>
+          <w14:ligatures w14:val="none"/>
+        </w:rPr>
+        <w:t>sklearn.feature</w:t>
+      </w:r>
+      <w:proofErr w:type="gramEnd"/>
+      <w:r>
+        <w:rPr>
+          <w:rFonts w:ascii="Consolas" w:eastAsia="Times New Roman" w:hAnsi="Consolas" w:cs="Times New Roman"/>
+          <w:color w:val="CCCCCC"/>
+          <w:kern w:val="0"/>
+          <w:sz w:val="16"/>
+          <w:szCs w:val="16"/>
+          <w14:ligatures w14:val="none"/>
+        </w:rPr>
+        <w:t>_selection</w:t>
       </w:r>
       <w:proofErr w:type="spellEnd"/>
       <w:r>
@@ -4433,6 +4869,7 @@
         <w:t xml:space="preserve"> </w:t>
       </w:r>
       <w:proofErr w:type="spellStart"/>
+      <w:proofErr w:type="gramStart"/>
       <w:r>
         <w:rPr>
           <w:rFonts w:ascii="Consolas" w:eastAsia="Times New Roman" w:hAnsi="Consolas" w:cs="Times New Roman"/>
@@ -4445,6 +4882,7 @@
         <w:t>sklearn.ensemble</w:t>
       </w:r>
       <w:proofErr w:type="spellEnd"/>
+      <w:proofErr w:type="gramEnd"/>
       <w:r>
         <w:rPr>
           <w:rFonts w:ascii="Consolas" w:eastAsia="Times New Roman" w:hAnsi="Consolas" w:cs="Times New Roman"/>
@@ -4551,7 +4989,31 @@
           <w:szCs w:val="16"/>
           <w14:ligatures w14:val="none"/>
         </w:rPr>
-        <w:t xml:space="preserve"> Pipeline([</w:t>
+        <w:t xml:space="preserve"> </w:t>
+      </w:r>
+      <w:proofErr w:type="gramStart"/>
+      <w:r>
+        <w:rPr>
+          <w:rFonts w:ascii="Consolas" w:eastAsia="Times New Roman" w:hAnsi="Consolas" w:cs="Times New Roman"/>
+          <w:color w:val="CCCCCC"/>
+          <w:kern w:val="0"/>
+          <w:sz w:val="16"/>
+          <w:szCs w:val="16"/>
+          <w14:ligatures w14:val="none"/>
+        </w:rPr>
+        <w:t>Pipeline(</w:t>
+      </w:r>
+      <w:proofErr w:type="gramEnd"/>
+      <w:r>
+        <w:rPr>
+          <w:rFonts w:ascii="Consolas" w:eastAsia="Times New Roman" w:hAnsi="Consolas" w:cs="Times New Roman"/>
+          <w:color w:val="CCCCCC"/>
+          <w:kern w:val="0"/>
+          <w:sz w:val="16"/>
+          <w:szCs w:val="16"/>
+          <w14:ligatures w14:val="none"/>
+        </w:rPr>
+        <w:t>[</w:t>
       </w:r>
     </w:p>
     <w:p>
@@ -4652,6 +5114,7 @@
         <w:t xml:space="preserve">, </w:t>
       </w:r>
       <w:proofErr w:type="spellStart"/>
+      <w:proofErr w:type="gramStart"/>
       <w:r>
         <w:rPr>
           <w:rFonts w:ascii="Consolas" w:eastAsia="Times New Roman" w:hAnsi="Consolas" w:cs="Times New Roman"/>
@@ -4676,6 +5139,7 @@
         <w:t>(</w:t>
       </w:r>
       <w:proofErr w:type="spellStart"/>
+      <w:proofErr w:type="gramEnd"/>
       <w:r>
         <w:rPr>
           <w:rFonts w:ascii="Consolas" w:eastAsia="Times New Roman" w:hAnsi="Consolas" w:cs="Times New Roman"/>
@@ -4814,7 +5278,19 @@
           <w:szCs w:val="16"/>
           <w14:ligatures w14:val="none"/>
         </w:rPr>
-        <w:t>)),  </w:t>
+        <w:t>)</w:t>
+      </w:r>
+      <w:proofErr w:type="gramStart"/>
+      <w:r>
+        <w:rPr>
+          <w:rFonts w:ascii="Consolas" w:eastAsia="Times New Roman" w:hAnsi="Consolas" w:cs="Times New Roman"/>
+          <w:color w:val="CCCCCC"/>
+          <w:kern w:val="0"/>
+          <w:sz w:val="16"/>
+          <w:szCs w:val="16"/>
+          <w14:ligatures w14:val="none"/>
+        </w:rPr>
+        <w:t>),  </w:t>
       </w:r>
       <w:r>
         <w:rPr>
@@ -4825,7 +5301,19 @@
           <w:szCs w:val="16"/>
           <w14:ligatures w14:val="none"/>
         </w:rPr>
-        <w:t># min feature importance</w:t>
+        <w:t>#</w:t>
+      </w:r>
+      <w:proofErr w:type="gramEnd"/>
+      <w:r>
+        <w:rPr>
+          <w:rFonts w:ascii="Consolas" w:eastAsia="Times New Roman" w:hAnsi="Consolas" w:cs="Times New Roman"/>
+          <w:color w:val="6A9955"/>
+          <w:kern w:val="0"/>
+          <w:sz w:val="16"/>
+          <w:szCs w:val="16"/>
+          <w14:ligatures w14:val="none"/>
+        </w:rPr>
+        <w:t xml:space="preserve"> min feature importance</w:t>
       </w:r>
     </w:p>
     <w:p>
@@ -4932,7 +5420,31 @@
           <w:szCs w:val="16"/>
           <w14:ligatures w14:val="none"/>
         </w:rPr>
-        <w:t>random_search.best_params</w:t>
+        <w:t>random_</w:t>
+      </w:r>
+      <w:proofErr w:type="gramStart"/>
+      <w:r>
+        <w:rPr>
+          <w:rFonts w:ascii="Consolas" w:eastAsia="Times New Roman" w:hAnsi="Consolas" w:cs="Times New Roman"/>
+          <w:color w:val="CCCCCC"/>
+          <w:kern w:val="0"/>
+          <w:sz w:val="16"/>
+          <w:szCs w:val="16"/>
+          <w14:ligatures w14:val="none"/>
+        </w:rPr>
+        <w:t>search.best</w:t>
+      </w:r>
+      <w:proofErr w:type="gramEnd"/>
+      <w:r>
+        <w:rPr>
+          <w:rFonts w:ascii="Consolas" w:eastAsia="Times New Roman" w:hAnsi="Consolas" w:cs="Times New Roman"/>
+          <w:color w:val="CCCCCC"/>
+          <w:kern w:val="0"/>
+          <w:sz w:val="16"/>
+          <w:szCs w:val="16"/>
+          <w14:ligatures w14:val="none"/>
+        </w:rPr>
+        <w:t>_params</w:t>
       </w:r>
       <w:proofErr w:type="spellEnd"/>
       <w:r>
@@ -5051,7 +5563,31 @@
           <w:szCs w:val="16"/>
           <w14:ligatures w14:val="none"/>
         </w:rPr>
-        <w:t>random_search.best_params</w:t>
+        <w:t>random_</w:t>
+      </w:r>
+      <w:proofErr w:type="gramStart"/>
+      <w:r>
+        <w:rPr>
+          <w:rFonts w:ascii="Consolas" w:eastAsia="Times New Roman" w:hAnsi="Consolas" w:cs="Times New Roman"/>
+          <w:color w:val="CCCCCC"/>
+          <w:kern w:val="0"/>
+          <w:sz w:val="16"/>
+          <w:szCs w:val="16"/>
+          <w14:ligatures w14:val="none"/>
+        </w:rPr>
+        <w:t>search.best</w:t>
+      </w:r>
+      <w:proofErr w:type="gramEnd"/>
+      <w:r>
+        <w:rPr>
+          <w:rFonts w:ascii="Consolas" w:eastAsia="Times New Roman" w:hAnsi="Consolas" w:cs="Times New Roman"/>
+          <w:color w:val="CCCCCC"/>
+          <w:kern w:val="0"/>
+          <w:sz w:val="16"/>
+          <w:szCs w:val="16"/>
+          <w14:ligatures w14:val="none"/>
+        </w:rPr>
+        <w:t>_params</w:t>
       </w:r>
       <w:proofErr w:type="spellEnd"/>
       <w:r>
@@ -5169,18 +5705,42 @@
           <w:szCs w:val="16"/>
           <w14:ligatures w14:val="none"/>
         </w:rPr>
-        <w:t>"linear"</w:t>
-      </w:r>
-      <w:r>
-        <w:rPr>
-          <w:rFonts w:ascii="Consolas" w:eastAsia="Times New Roman" w:hAnsi="Consolas" w:cs="Times New Roman"/>
-          <w:color w:val="CCCCCC"/>
-          <w:kern w:val="0"/>
-          <w:sz w:val="16"/>
-          <w:szCs w:val="16"/>
-          <w14:ligatures w14:val="none"/>
-        </w:rPr>
-        <w:t>)),</w:t>
+        <w:t>"</w:t>
+      </w:r>
+      <w:proofErr w:type="gramStart"/>
+      <w:r>
+        <w:rPr>
+          <w:rFonts w:ascii="Consolas" w:eastAsia="Times New Roman" w:hAnsi="Consolas" w:cs="Times New Roman"/>
+          <w:color w:val="CE9178"/>
+          <w:kern w:val="0"/>
+          <w:sz w:val="16"/>
+          <w:szCs w:val="16"/>
+          <w14:ligatures w14:val="none"/>
+        </w:rPr>
+        <w:t>linear"</w:t>
+      </w:r>
+      <w:r>
+        <w:rPr>
+          <w:rFonts w:ascii="Consolas" w:eastAsia="Times New Roman" w:hAnsi="Consolas" w:cs="Times New Roman"/>
+          <w:color w:val="CCCCCC"/>
+          <w:kern w:val="0"/>
+          <w:sz w:val="16"/>
+          <w:szCs w:val="16"/>
+          <w14:ligatures w14:val="none"/>
+        </w:rPr>
+        <w:t>)</w:t>
+      </w:r>
+      <w:proofErr w:type="gramEnd"/>
+      <w:r>
+        <w:rPr>
+          <w:rFonts w:ascii="Consolas" w:eastAsia="Times New Roman" w:hAnsi="Consolas" w:cs="Times New Roman"/>
+          <w:color w:val="CCCCCC"/>
+          <w:kern w:val="0"/>
+          <w:sz w:val="16"/>
+          <w:szCs w:val="16"/>
+          <w14:ligatures w14:val="none"/>
+        </w:rPr>
+        <w:t>),</w:t>
       </w:r>
     </w:p>
     <w:p>
@@ -5224,7 +5784,7 @@
         <w:jc w:val="left"/>
       </w:pPr>
       <w:r>
-        <w:t>Using Select from Model Random Search RMSE is  78,2445</w:t>
+        <w:t>Using Select from Model Random Search RMSE is 78,2445</w:t>
       </w:r>
     </w:p>
     <w:sectPr>

</xml_diff>